<commit_message>
court(texcrimapp): motion-brief engines regenerated on the current model, still reported (fb-595.54.68)
Co-Authored-By: Claude Opus 5.5 <noreply@anthropic.com>
</commit_message>
<xml_diff>
--- a/courts/fifth-circuit/texas/state/court-of-criminal-appeals/motion-brief/usage/OUTPUT-motion-brief.docx
+++ b/courts/fifth-circuit/texas/state/court-of-criminal-appeals/motion-brief/usage/OUTPUT-motion-brief.docx
@@ -2422,7 +2422,7 @@
         <w:pStyle w:val="BodyText"/>
       </w:pPr>
       <w:r>
-        <w:t xml:space="preserve">no impact sites. . . . There are three – four incisions in her skin there</w:t>
+        <w:t xml:space="preserve">no impact sites. . . . There are three – four incisions in her skin there</w:t>
       </w:r>
     </w:p>
     <w:p>
@@ -5786,7 +5786,7 @@
         <w:pStyle w:val="BodyText"/>
       </w:pPr>
       <w:r>
-        <w:t xml:space="preserve">The Roark and Roberson cases involve essentially the same discredited science challenged using the same Texas law: Article 11.073. In both cases, the State even relied on the same CAP (Dr. Squires) whose same discredited SBS diagnosis of trial that would lend credibility to the opinion of such an expert” and granting new trial); People v. Bailey, 41 N.Y.S.3d 625, 627 (App. Div. 2016) (holding that “advancements in science and/​or medicine may constitute newly discovered evidence” and “defendant established . . . that ‘a significant and legitimate debate in the medical community has developed in the past ten years over whether infants [and toddlers] can be fatally injured through shaking alone’” and affirming lower court ruling vacating SBS/​AHT conviction) (alteration in original, citation omitted); Jones v. State, No. 0087, 2021 WL 346552, *11</w:t>
+        <w:t xml:space="preserve">The Roark and Roberson cases involve essentially the same discredited science challenged using the same Texas law: Article 11.073. In both cases, the State even relied on the same CAP (Dr. Squires) whose same discredited SBS diagnosis of trial that would lend credibility to the opinion of such an expert” and granting new trial); People v. Bailey, 41 N.Y.S.3d 625, 627 (App. Div. 2016) (holding that “advancements in science and/​or medicine may constitute newly discovered evidence” and “defendant established . . . that ‘a significant and legitimate debate in the medical community has developed in the past ten years over whether infants [and toddlers] can be fatally injured through shaking alone’” and affirming lower court ruling vacating SBS/​AHT conviction) (alteration in original, citation omitted); Jones v. State, No. 0087, 2021 WL 346552, *11</w:t>
       </w:r>
       <w:r>
         <w:noBreakHyphen/>
@@ -7106,7 +7106,7 @@
         <w:t xml:space="preserve"> </w:t>
       </w:r>
       <w:r>
-        <w:t xml:space="preserve">This statement is confusing because Article 37.071 is a statute that deals only with death-penalty trials, not habeas proceedings—and there is no section 5 in that statute; it only goes to section 2.</w:t>
+        <w:t xml:space="preserve">This statement is confusing because Article 37.071 is a statute that deals only with death-⁠penalty trials, not habeas proceedings—⁠and there is no section 5 in that statute; it only goes to section 2.</w:t>
       </w:r>
     </w:p>
   </w:footnote>
@@ -7365,7 +7365,7 @@
         <w:t xml:space="preserve"> </w:t>
       </w:r>
       <w:r>
-        <w:t xml:space="preserve">On its website, this entity defines itself as “a research and educational institution whose mission is to educate and inform the public and policymakers regarding parental rights with a goal of ‘securing the blessings of liberty to ourselves and our posterity.’” See https://parentalrightsfoundation.org/.</w:t>
+        <w:t xml:space="preserve">On its website, this entity defines itself as “a research and educational institution whose mission is to educate and inform the public and policymakers regarding parental rights with a goal of ‘securing the blessings of liberty to ourselves and our posterity.’” See https://​parentalrightsfoundation.​org/​.</w:t>
       </w:r>
     </w:p>
   </w:footnote>
@@ -8175,6 +8175,7 @@
     <w:unhideWhenUsed/>
     <w:qFormat/>
     <w:pPr>
+      <w:keepLines/>
       <w:spacing w:before="0" w:after="140" w:line="276" w:lineRule="exact"/>
     </w:pPr>
     <w:rPr>
@@ -8425,6 +8426,33 @@
     <w:pPr>
       <w:spacing w:before="0" w:after="0" w:line="322" w:lineRule="exact"/>
       <w:ind w:left="2160" w:hanging="720"/>
+    </w:pPr>
+  </w:style>
+  <w:style w:type="paragraph" w:customStyle="1" w:styleId="XdQuoteList1">
+    <w:name w:val="Xd Quote List 1"/>
+    <w:basedOn w:val="Normal"/>
+    <w:qFormat/>
+    <w:pPr>
+      <w:spacing w:before="0" w:after="0" w:line="322" w:lineRule="exact"/>
+      <w:ind w:left="1440" w:right="720" w:hanging="720"/>
+    </w:pPr>
+  </w:style>
+  <w:style w:type="paragraph" w:customStyle="1" w:styleId="XdQuoteList2">
+    <w:name w:val="Xd Quote List 2"/>
+    <w:basedOn w:val="Normal"/>
+    <w:qFormat/>
+    <w:pPr>
+      <w:spacing w:before="0" w:after="0" w:line="322" w:lineRule="exact"/>
+      <w:ind w:left="2160" w:right="720" w:hanging="720"/>
+    </w:pPr>
+  </w:style>
+  <w:style w:type="paragraph" w:customStyle="1" w:styleId="XdQuoteList3">
+    <w:name w:val="Xd Quote List 3"/>
+    <w:basedOn w:val="Normal"/>
+    <w:qFormat/>
+    <w:pPr>
+      <w:spacing w:before="0" w:after="0" w:line="322" w:lineRule="exact"/>
+      <w:ind w:left="2880" w:right="720" w:hanging="720"/>
     </w:pPr>
   </w:style>
   <w:style w:type="paragraph" w:customStyle="1" w:styleId="XdList1">

</xml_diff>